<commit_message>
Lab 1 has been corrected, and ContentListForm has been prepared.
</commit_message>
<xml_diff>
--- a/Основы Разработки Баз Данных/Lab1/Video hosting content management Report1.docx
+++ b/Основы Разработки Баз Данных/Lab1/Video hosting content management Report1.docx
@@ -169,8 +169,6 @@
         </w:rPr>
         <w:t>MICROSOFT SQL SERVER</w:t>
       </w:r>
-      <w:bookmarkStart w:id="3" w:name="_GoBack"/>
-      <w:bookmarkEnd w:id="3"/>
     </w:p>
     <w:p>
       <w:pPr>
@@ -1159,14 +1157,14 @@
       <w:pPr>
         <w:pStyle w:val="12"/>
       </w:pPr>
-      <w:bookmarkStart w:id="4" w:name="_Toc225850189"/>
-      <w:bookmarkStart w:id="5" w:name="_Toc225850742"/>
+      <w:bookmarkStart w:id="3" w:name="_Toc225850189"/>
+      <w:bookmarkStart w:id="4" w:name="_Toc225850742"/>
       <w:r>
         <w:lastRenderedPageBreak/>
         <w:t>Введение</w:t>
       </w:r>
+      <w:bookmarkEnd w:id="3"/>
       <w:bookmarkEnd w:id="4"/>
-      <w:bookmarkEnd w:id="5"/>
     </w:p>
     <w:p>
       <w:pPr>
@@ -1229,16 +1227,16 @@
       <w:pPr>
         <w:pStyle w:val="1"/>
       </w:pPr>
-      <w:bookmarkStart w:id="6" w:name="_Toc225848296"/>
-      <w:bookmarkStart w:id="7" w:name="_Toc225850190"/>
-      <w:bookmarkStart w:id="8" w:name="_Toc225850743"/>
+      <w:bookmarkStart w:id="5" w:name="_Toc225848296"/>
+      <w:bookmarkStart w:id="6" w:name="_Toc225850190"/>
+      <w:bookmarkStart w:id="7" w:name="_Toc225850743"/>
       <w:r>
         <w:lastRenderedPageBreak/>
         <w:t xml:space="preserve">1 </w:t>
       </w:r>
+      <w:bookmarkEnd w:id="5"/>
       <w:bookmarkEnd w:id="6"/>
       <w:bookmarkEnd w:id="7"/>
-      <w:bookmarkEnd w:id="8"/>
       <w:r>
         <w:t>создание бызы даннных</w:t>
       </w:r>
@@ -1410,7 +1408,13 @@
         <w:rPr>
           <w:lang w:eastAsia="ru-RU"/>
         </w:rPr>
-        <w:t>обозреватель объектов с базой данных</w:t>
+        <w:t>О</w:t>
+      </w:r>
+      <w:r>
+        <w:rPr>
+          <w:lang w:eastAsia="ru-RU"/>
+        </w:rPr>
+        <w:t>бозреватель объектов с базой данных</w:t>
       </w:r>
     </w:p>
     <w:p>
@@ -1608,9 +1612,9 @@
           <w:lang w:eastAsia="ru-RU"/>
         </w:rPr>
       </w:pPr>
-      <w:bookmarkStart w:id="9" w:name="_Toc225848297"/>
-      <w:bookmarkStart w:id="10" w:name="_Toc225850191"/>
-      <w:bookmarkStart w:id="11" w:name="_Toc225850744"/>
+      <w:bookmarkStart w:id="8" w:name="_Toc225848297"/>
+      <w:bookmarkStart w:id="9" w:name="_Toc225850191"/>
+      <w:bookmarkStart w:id="10" w:name="_Toc225850744"/>
       <w:r>
         <w:br w:type="page"/>
       </w:r>
@@ -1623,239 +1627,247 @@
         <w:lastRenderedPageBreak/>
         <w:t xml:space="preserve">2 </w:t>
       </w:r>
+      <w:bookmarkEnd w:id="8"/>
       <w:bookmarkEnd w:id="9"/>
       <w:bookmarkEnd w:id="10"/>
+      <w:r>
+        <w:t>создание таблиц</w:t>
+      </w:r>
+    </w:p>
+    <w:p>
+      <w:pPr>
+        <w:pStyle w:val="a4"/>
+        <w:rPr>
+          <w:lang w:eastAsia="ru-RU"/>
+        </w:rPr>
+      </w:pPr>
+    </w:p>
+    <w:p>
+      <w:pPr>
+        <w:pStyle w:val="a4"/>
+        <w:rPr>
+          <w:lang w:eastAsia="ru-RU"/>
+        </w:rPr>
+      </w:pPr>
+      <w:r>
+        <w:rPr>
+          <w:lang w:eastAsia="ru-RU"/>
+        </w:rPr>
+        <w:t xml:space="preserve">На основе нормализованной реляционной модели были разработаны таблицы: Правообладатель, Жанр, Контент, Договор, Лицензия, </w:t>
+      </w:r>
+      <w:proofErr w:type="spellStart"/>
+      <w:r>
+        <w:rPr>
+          <w:lang w:eastAsia="ru-RU"/>
+        </w:rPr>
+        <w:t>Контент_Жанр</w:t>
+      </w:r>
+      <w:proofErr w:type="spellEnd"/>
+      <w:r>
+        <w:rPr>
+          <w:lang w:eastAsia="ru-RU"/>
+        </w:rPr>
+        <w:t xml:space="preserve">, </w:t>
+      </w:r>
+      <w:proofErr w:type="spellStart"/>
+      <w:r>
+        <w:rPr>
+          <w:lang w:eastAsia="ru-RU"/>
+        </w:rPr>
+        <w:t>Медиа_файл</w:t>
+      </w:r>
+      <w:proofErr w:type="spellEnd"/>
+      <w:r>
+        <w:rPr>
+          <w:lang w:eastAsia="ru-RU"/>
+        </w:rPr>
+        <w:t>. Для каждой таблицы в конструкторе определены столбцы, типы данных, атрибуты NULL/NOT NULL, а также первичные ключи. Для столбцов-идентификаторов (</w:t>
+      </w:r>
+      <w:proofErr w:type="spellStart"/>
+      <w:r>
+        <w:rPr>
+          <w:lang w:eastAsia="ru-RU"/>
+        </w:rPr>
+        <w:t>ID_правообладателя</w:t>
+      </w:r>
+      <w:proofErr w:type="spellEnd"/>
+      <w:r>
+        <w:rPr>
+          <w:lang w:eastAsia="ru-RU"/>
+        </w:rPr>
+        <w:t xml:space="preserve">, </w:t>
+      </w:r>
+      <w:proofErr w:type="spellStart"/>
+      <w:r>
+        <w:rPr>
+          <w:lang w:eastAsia="ru-RU"/>
+        </w:rPr>
+        <w:t>ID_контента</w:t>
+      </w:r>
+      <w:proofErr w:type="spellEnd"/>
+      <w:r>
+        <w:rPr>
+          <w:lang w:eastAsia="ru-RU"/>
+        </w:rPr>
+        <w:t xml:space="preserve">, </w:t>
+      </w:r>
+      <w:proofErr w:type="spellStart"/>
+      <w:r>
+        <w:rPr>
+          <w:lang w:eastAsia="ru-RU"/>
+        </w:rPr>
+        <w:t>ID_лицензии</w:t>
+      </w:r>
+      <w:proofErr w:type="spellEnd"/>
+      <w:r>
+        <w:rPr>
+          <w:lang w:eastAsia="ru-RU"/>
+        </w:rPr>
+        <w:t xml:space="preserve">, </w:t>
+      </w:r>
+      <w:proofErr w:type="spellStart"/>
+      <w:r>
+        <w:rPr>
+          <w:lang w:eastAsia="ru-RU"/>
+        </w:rPr>
+        <w:t>ID_файла</w:t>
+      </w:r>
+      <w:proofErr w:type="spellEnd"/>
+      <w:r>
+        <w:rPr>
+          <w:lang w:eastAsia="ru-RU"/>
+        </w:rPr>
+        <w:t xml:space="preserve">, </w:t>
+      </w:r>
+      <w:proofErr w:type="spellStart"/>
+      <w:r>
+        <w:rPr>
+          <w:lang w:eastAsia="ru-RU"/>
+        </w:rPr>
+        <w:t>ID_жанра</w:t>
+      </w:r>
+      <w:proofErr w:type="spellEnd"/>
+      <w:r>
+        <w:rPr>
+          <w:lang w:eastAsia="ru-RU"/>
+        </w:rPr>
+        <w:t xml:space="preserve">) установлено свойство </w:t>
+      </w:r>
+      <w:proofErr w:type="spellStart"/>
+      <w:r>
+        <w:rPr>
+          <w:lang w:eastAsia="ru-RU"/>
+        </w:rPr>
+        <w:t>Identity</w:t>
+      </w:r>
+      <w:proofErr w:type="spellEnd"/>
+      <w:r>
+        <w:rPr>
+          <w:lang w:eastAsia="ru-RU"/>
+        </w:rPr>
+        <w:t xml:space="preserve"> (начальное значение 1, шаг 1). В таблице Договор первичным ключом выбран естественный ключ – </w:t>
+      </w:r>
+      <w:proofErr w:type="spellStart"/>
+      <w:r>
+        <w:rPr>
+          <w:lang w:eastAsia="ru-RU"/>
+        </w:rPr>
+        <w:t>номер_договора</w:t>
+      </w:r>
+      <w:proofErr w:type="spellEnd"/>
+      <w:r>
+        <w:rPr>
+          <w:lang w:eastAsia="ru-RU"/>
+        </w:rPr>
+        <w:t xml:space="preserve">. Для таблицы </w:t>
+      </w:r>
+      <w:proofErr w:type="spellStart"/>
+      <w:r>
+        <w:rPr>
+          <w:lang w:eastAsia="ru-RU"/>
+        </w:rPr>
+        <w:t>Контент_Жанр</w:t>
+      </w:r>
+      <w:proofErr w:type="spellEnd"/>
+      <w:r>
+        <w:rPr>
+          <w:lang w:eastAsia="ru-RU"/>
+        </w:rPr>
+        <w:t xml:space="preserve"> первичный ключ составной – из полей </w:t>
+      </w:r>
+      <w:proofErr w:type="spellStart"/>
+      <w:r>
+        <w:rPr>
+          <w:lang w:eastAsia="ru-RU"/>
+        </w:rPr>
+        <w:t>ID_контента</w:t>
+      </w:r>
+      <w:proofErr w:type="spellEnd"/>
+      <w:r>
+        <w:rPr>
+          <w:lang w:eastAsia="ru-RU"/>
+        </w:rPr>
+        <w:t xml:space="preserve"> и </w:t>
+      </w:r>
+      <w:proofErr w:type="spellStart"/>
+      <w:r>
+        <w:rPr>
+          <w:lang w:eastAsia="ru-RU"/>
+        </w:rPr>
+        <w:t>ID_жанра</w:t>
+      </w:r>
+      <w:proofErr w:type="spellEnd"/>
+      <w:r>
+        <w:rPr>
+          <w:lang w:eastAsia="ru-RU"/>
+        </w:rPr>
+        <w:t>.</w:t>
+      </w:r>
+    </w:p>
+    <w:p>
+      <w:pPr>
+        <w:pStyle w:val="a4"/>
+        <w:rPr>
+          <w:lang w:eastAsia="ru-RU"/>
+        </w:rPr>
+      </w:pPr>
+      <w:r>
+        <w:rPr>
+          <w:lang w:eastAsia="ru-RU"/>
+        </w:rPr>
+        <w:t>На рисунках 2</w:t>
+      </w:r>
+      <w:r>
+        <w:rPr>
+          <w:lang w:eastAsia="ru-RU"/>
+        </w:rPr>
+        <w:t>.1</w:t>
+      </w:r>
+      <w:r>
+        <w:rPr>
+          <w:lang w:eastAsia="ru-RU"/>
+        </w:rPr>
+        <w:t>–</w:t>
+      </w:r>
+      <w:r>
+        <w:rPr>
+          <w:lang w:eastAsia="ru-RU"/>
+        </w:rPr>
+        <w:t>2.</w:t>
+      </w:r>
+      <w:r>
+        <w:rPr>
+          <w:lang w:eastAsia="ru-RU"/>
+        </w:rPr>
+        <w:t>7</w:t>
+      </w:r>
+      <w:bookmarkStart w:id="11" w:name="_GoBack"/>
       <w:bookmarkEnd w:id="11"/>
       <w:r>
-        <w:t>создание таблиц</w:t>
-      </w:r>
-    </w:p>
-    <w:p>
-      <w:pPr>
-        <w:pStyle w:val="a4"/>
-        <w:rPr>
-          <w:lang w:eastAsia="ru-RU"/>
-        </w:rPr>
-      </w:pPr>
-    </w:p>
-    <w:p>
-      <w:pPr>
-        <w:pStyle w:val="a4"/>
-        <w:rPr>
-          <w:lang w:eastAsia="ru-RU"/>
-        </w:rPr>
-      </w:pPr>
-      <w:r>
-        <w:rPr>
-          <w:lang w:eastAsia="ru-RU"/>
-        </w:rPr>
-        <w:t xml:space="preserve">На основе нормализованной реляционной модели были разработаны таблицы: Правообладатель, Жанр, Контент, Договор, Лицензия, </w:t>
-      </w:r>
-      <w:proofErr w:type="spellStart"/>
-      <w:r>
-        <w:rPr>
-          <w:lang w:eastAsia="ru-RU"/>
-        </w:rPr>
-        <w:t>Контент_Жанр</w:t>
-      </w:r>
-      <w:proofErr w:type="spellEnd"/>
-      <w:r>
-        <w:rPr>
-          <w:lang w:eastAsia="ru-RU"/>
-        </w:rPr>
-        <w:t xml:space="preserve">, </w:t>
-      </w:r>
-      <w:proofErr w:type="spellStart"/>
-      <w:r>
-        <w:rPr>
-          <w:lang w:eastAsia="ru-RU"/>
-        </w:rPr>
-        <w:t>Медиа_файл</w:t>
-      </w:r>
-      <w:proofErr w:type="spellEnd"/>
-      <w:r>
-        <w:rPr>
-          <w:lang w:eastAsia="ru-RU"/>
-        </w:rPr>
-        <w:t>. Для каждой таблицы в конструкторе определены столбцы, типы данных, атрибуты NULL/NOT NULL, а также первичные ключи. Для столбцов-идентификаторов (</w:t>
-      </w:r>
-      <w:proofErr w:type="spellStart"/>
-      <w:r>
-        <w:rPr>
-          <w:lang w:eastAsia="ru-RU"/>
-        </w:rPr>
-        <w:t>ID_правообладателя</w:t>
-      </w:r>
-      <w:proofErr w:type="spellEnd"/>
-      <w:r>
-        <w:rPr>
-          <w:lang w:eastAsia="ru-RU"/>
-        </w:rPr>
-        <w:t xml:space="preserve">, </w:t>
-      </w:r>
-      <w:proofErr w:type="spellStart"/>
-      <w:r>
-        <w:rPr>
-          <w:lang w:eastAsia="ru-RU"/>
-        </w:rPr>
-        <w:t>ID_контента</w:t>
-      </w:r>
-      <w:proofErr w:type="spellEnd"/>
-      <w:r>
-        <w:rPr>
-          <w:lang w:eastAsia="ru-RU"/>
-        </w:rPr>
-        <w:t xml:space="preserve">, </w:t>
-      </w:r>
-      <w:proofErr w:type="spellStart"/>
-      <w:r>
-        <w:rPr>
-          <w:lang w:eastAsia="ru-RU"/>
-        </w:rPr>
-        <w:t>ID_лицензии</w:t>
-      </w:r>
-      <w:proofErr w:type="spellEnd"/>
-      <w:r>
-        <w:rPr>
-          <w:lang w:eastAsia="ru-RU"/>
-        </w:rPr>
-        <w:t xml:space="preserve">, </w:t>
-      </w:r>
-      <w:proofErr w:type="spellStart"/>
-      <w:r>
-        <w:rPr>
-          <w:lang w:eastAsia="ru-RU"/>
-        </w:rPr>
-        <w:t>ID_файла</w:t>
-      </w:r>
-      <w:proofErr w:type="spellEnd"/>
-      <w:r>
-        <w:rPr>
-          <w:lang w:eastAsia="ru-RU"/>
-        </w:rPr>
-        <w:t xml:space="preserve">, </w:t>
-      </w:r>
-      <w:proofErr w:type="spellStart"/>
-      <w:r>
-        <w:rPr>
-          <w:lang w:eastAsia="ru-RU"/>
-        </w:rPr>
-        <w:t>ID_жанра</w:t>
-      </w:r>
-      <w:proofErr w:type="spellEnd"/>
-      <w:r>
-        <w:rPr>
-          <w:lang w:eastAsia="ru-RU"/>
-        </w:rPr>
-        <w:t xml:space="preserve">) установлено свойство </w:t>
-      </w:r>
-      <w:proofErr w:type="spellStart"/>
-      <w:r>
-        <w:rPr>
-          <w:lang w:eastAsia="ru-RU"/>
-        </w:rPr>
-        <w:t>Identity</w:t>
-      </w:r>
-      <w:proofErr w:type="spellEnd"/>
-      <w:r>
-        <w:rPr>
-          <w:lang w:eastAsia="ru-RU"/>
-        </w:rPr>
-        <w:t xml:space="preserve"> (начальное значение 1, шаг 1). В таблице Договор первичным ключом выбран естественный ключ – </w:t>
-      </w:r>
-      <w:proofErr w:type="spellStart"/>
-      <w:r>
-        <w:rPr>
-          <w:lang w:eastAsia="ru-RU"/>
-        </w:rPr>
-        <w:t>номер_договора</w:t>
-      </w:r>
-      <w:proofErr w:type="spellEnd"/>
-      <w:r>
-        <w:rPr>
-          <w:lang w:eastAsia="ru-RU"/>
-        </w:rPr>
-        <w:t xml:space="preserve">. Для таблицы </w:t>
-      </w:r>
-      <w:proofErr w:type="spellStart"/>
-      <w:r>
-        <w:rPr>
-          <w:lang w:eastAsia="ru-RU"/>
-        </w:rPr>
-        <w:t>Контент_Жанр</w:t>
-      </w:r>
-      <w:proofErr w:type="spellEnd"/>
-      <w:r>
-        <w:rPr>
-          <w:lang w:eastAsia="ru-RU"/>
-        </w:rPr>
-        <w:t xml:space="preserve"> первичный ключ составной – из полей </w:t>
-      </w:r>
-      <w:proofErr w:type="spellStart"/>
-      <w:r>
-        <w:rPr>
-          <w:lang w:eastAsia="ru-RU"/>
-        </w:rPr>
-        <w:t>ID_контента</w:t>
-      </w:r>
-      <w:proofErr w:type="spellEnd"/>
-      <w:r>
-        <w:rPr>
-          <w:lang w:eastAsia="ru-RU"/>
-        </w:rPr>
-        <w:t xml:space="preserve"> и </w:t>
-      </w:r>
-      <w:proofErr w:type="spellStart"/>
-      <w:r>
-        <w:rPr>
-          <w:lang w:eastAsia="ru-RU"/>
-        </w:rPr>
-        <w:t>ID_жанра</w:t>
-      </w:r>
-      <w:proofErr w:type="spellEnd"/>
-      <w:r>
-        <w:rPr>
-          <w:lang w:eastAsia="ru-RU"/>
-        </w:rPr>
-        <w:t>.</w:t>
-      </w:r>
-    </w:p>
-    <w:p>
-      <w:pPr>
-        <w:pStyle w:val="a4"/>
-        <w:rPr>
-          <w:lang w:eastAsia="ru-RU"/>
-        </w:rPr>
-      </w:pPr>
-      <w:r>
-        <w:rPr>
-          <w:lang w:eastAsia="ru-RU"/>
-        </w:rPr>
-        <w:t>На рисунках 2</w:t>
-      </w:r>
-      <w:r>
-        <w:rPr>
-          <w:lang w:eastAsia="ru-RU"/>
-        </w:rPr>
-        <w:t>.1</w:t>
-      </w:r>
-      <w:r>
-        <w:rPr>
-          <w:lang w:eastAsia="ru-RU"/>
-        </w:rPr>
-        <w:t>–</w:t>
-      </w:r>
-      <w:r>
-        <w:rPr>
-          <w:lang w:eastAsia="ru-RU"/>
-        </w:rPr>
-        <w:t>2.</w:t>
-      </w:r>
-      <w:r>
-        <w:rPr>
-          <w:lang w:eastAsia="ru-RU"/>
-        </w:rPr>
-        <w:t>8 представлены все</w:t>
+        <w:rPr>
+          <w:lang w:eastAsia="ru-RU"/>
+        </w:rPr>
+        <w:t xml:space="preserve"> представлены все</w:t>
       </w:r>
       <w:r>
         <w:rPr>
@@ -2203,7 +2215,13 @@
         <w:rPr>
           <w:lang w:eastAsia="ru-RU"/>
         </w:rPr>
-        <w:t>таблица Жанр</w:t>
+        <w:t>Т</w:t>
+      </w:r>
+      <w:r>
+        <w:rPr>
+          <w:lang w:eastAsia="ru-RU"/>
+        </w:rPr>
+        <w:t>аблица Жанр</w:t>
       </w:r>
     </w:p>
     <w:p>
@@ -2232,10 +2250,10 @@
           <w:lang w:val="en-US" w:eastAsia="ru-RU"/>
         </w:rPr>
         <w:drawing>
-          <wp:inline distT="0" distB="0" distL="0" distR="0" wp14:anchorId="0A2C1CAB" wp14:editId="4C790F73">
-            <wp:extent cx="3791479" cy="3410426"/>
+          <wp:inline distT="0" distB="0" distL="0" distR="0" wp14:anchorId="1DB55104" wp14:editId="099E984E">
+            <wp:extent cx="3772426" cy="3372321"/>
             <wp:effectExtent l="0" t="0" r="0" b="0"/>
-            <wp:docPr id="5" name="Рисунок 5"/>
+            <wp:docPr id="1" name="Рисунок 1"/>
             <wp:cNvGraphicFramePr>
               <a:graphicFrameLocks xmlns:a="http://schemas.openxmlformats.org/drawingml/2006/main" noChangeAspect="1"/>
             </wp:cNvGraphicFramePr>
@@ -2243,7 +2261,7 @@
               <a:graphicData uri="http://schemas.openxmlformats.org/drawingml/2006/picture">
                 <pic:pic xmlns:pic="http://schemas.openxmlformats.org/drawingml/2006/picture">
                   <pic:nvPicPr>
-                    <pic:cNvPr id="5" name="Контент.PNG"/>
+                    <pic:cNvPr id="1" name="Конткнт.PNG"/>
                     <pic:cNvPicPr/>
                   </pic:nvPicPr>
                   <pic:blipFill>
@@ -2261,7 +2279,7 @@
                   <pic:spPr>
                     <a:xfrm>
                       <a:off x="0" y="0"/>
-                      <a:ext cx="3791479" cy="3410426"/>
+                      <a:ext cx="3772426" cy="3372321"/>
                     </a:xfrm>
                     <a:prstGeom prst="rect">
                       <a:avLst/>
@@ -2318,7 +2336,13 @@
         <w:rPr>
           <w:lang w:eastAsia="ru-RU"/>
         </w:rPr>
-        <w:t>таблица Контент</w:t>
+        <w:t>Т</w:t>
+      </w:r>
+      <w:r>
+        <w:rPr>
+          <w:lang w:eastAsia="ru-RU"/>
+        </w:rPr>
+        <w:t>аблица Контент</w:t>
       </w:r>
     </w:p>
     <w:p>
@@ -2433,7 +2457,13 @@
         <w:rPr>
           <w:lang w:eastAsia="ru-RU"/>
         </w:rPr>
-        <w:t>таблица Лицензия</w:t>
+        <w:t>Т</w:t>
+      </w:r>
+      <w:r>
+        <w:rPr>
+          <w:lang w:eastAsia="ru-RU"/>
+        </w:rPr>
+        <w:t>аблица Лицензия</w:t>
       </w:r>
     </w:p>
     <w:p>
@@ -2549,7 +2579,13 @@
         <w:rPr>
           <w:lang w:eastAsia="ru-RU"/>
         </w:rPr>
-        <w:t xml:space="preserve">таблица </w:t>
+        <w:t>Т</w:t>
+      </w:r>
+      <w:r>
+        <w:rPr>
+          <w:lang w:eastAsia="ru-RU"/>
+        </w:rPr>
+        <w:t xml:space="preserve">аблица </w:t>
       </w:r>
       <w:proofErr w:type="spellStart"/>
       <w:r>
@@ -2671,7 +2707,13 @@
         <w:rPr>
           <w:lang w:eastAsia="ru-RU"/>
         </w:rPr>
-        <w:t xml:space="preserve">таблица </w:t>
+        <w:t>Т</w:t>
+      </w:r>
+      <w:r>
+        <w:rPr>
+          <w:lang w:eastAsia="ru-RU"/>
+        </w:rPr>
+        <w:t xml:space="preserve">аблица </w:t>
       </w:r>
       <w:proofErr w:type="spellStart"/>
       <w:r>
@@ -2842,13 +2884,8 @@
       <w:pPr>
         <w:pStyle w:val="a4"/>
       </w:pPr>
-    </w:p>
-    <w:p>
-      <w:pPr>
-        <w:pStyle w:val="a4"/>
-      </w:pPr>
-      <w:r>
-        <w:t>Для данной таблицы определено несколько проверочных ограничений:</w:t>
+      <w:r>
+        <w:t>На таблицу наложены следующие CHECK-ограничения:</w:t>
       </w:r>
     </w:p>
     <w:p>
@@ -2861,7 +2898,7 @@
       </w:r>
       <w:proofErr w:type="spellEnd"/>
       <w:r>
-        <w:t> – разрешает только значения '0+', '6+', '12+', '16+', '18+'.</w:t>
+        <w:t> – разрешает только значения '0+', '6+', '12+', '16+', '18+'.</w:t>
       </w:r>
     </w:p>
     <w:p>
@@ -2870,14 +2907,11 @@
       </w:pPr>
       <w:proofErr w:type="spellStart"/>
       <w:r>
-        <w:t>CK_Контент_Тип</w:t>
-      </w:r>
-      <w:r>
-        <w:t>_контента</w:t>
+        <w:t>CK_Контент_Тип_контента</w:t>
       </w:r>
       <w:proofErr w:type="spellEnd"/>
       <w:r>
-        <w:t> – ограничивает тип контента списком: 'Фильм', 'Мультфильм', 'Сериал', 'Мультсериал', 'Короткометражный фильм', 'Трейлер'.</w:t>
+        <w:t> – ограничивает тип контента списком: 'Фильм', 'Мультфильм', 'Сериал', 'Мультсериал', 'Короткометражный фильм', 'Трейлер'.</w:t>
       </w:r>
     </w:p>
     <w:p>
@@ -2904,7 +2938,15 @@
       </w:r>
       <w:proofErr w:type="spellEnd"/>
       <w:r>
-        <w:t> – устанавливает допустимый диапазон длительности от 0 до 600 минут (10 часов). Поле является обязательным.</w:t>
+        <w:t xml:space="preserve"> – устанавливает допустимый диапазон длительности от '00:00:00' до '23:59:59' (формат </w:t>
+      </w:r>
+      <w:proofErr w:type="gramStart"/>
+      <w:r>
+        <w:t>ЧЧ:ММ</w:t>
+      </w:r>
+      <w:proofErr w:type="gramEnd"/>
+      <w:r>
+        <w:t>:СС). Поле допускает значение NULL (необязательно для заполнения).</w:t>
       </w:r>
     </w:p>
     <w:p>
@@ -2917,7 +2959,7 @@
       </w:r>
       <w:proofErr w:type="spellEnd"/>
       <w:r>
-        <w:t> – ограничивает размер изображения-постера 10 мегабайтами (10 485 760 байт); допускается NULL.</w:t>
+        <w:t> – ограничивает размер изображения-постера 10 мегабайтами (10 485 760 байт); допускается NULL.</w:t>
       </w:r>
     </w:p>
     <w:p>
@@ -2941,6 +2983,402 @@
     <w:p>
       <w:pPr>
         <w:pStyle w:val="2"/>
+      </w:pPr>
+      <w:r>
+        <w:t>3.3 Таблица Договор</w:t>
+      </w:r>
+    </w:p>
+    <w:p>
+      <w:pPr>
+        <w:pStyle w:val="a4"/>
+      </w:pPr>
+    </w:p>
+    <w:p>
+      <w:pPr>
+        <w:pStyle w:val="a4"/>
+      </w:pPr>
+      <w:r>
+        <w:t>На таблицу наложены следующие CHECK-ограничения:</w:t>
+      </w:r>
+    </w:p>
+    <w:p>
+      <w:pPr>
+        <w:pStyle w:val="a1"/>
+      </w:pPr>
+      <w:proofErr w:type="spellStart"/>
+      <w:r>
+        <w:t>CK_Договор_Тип_лицензии</w:t>
+      </w:r>
+      <w:proofErr w:type="spellEnd"/>
+      <w:r>
+        <w:t xml:space="preserve"> – тип лицензии должен входить в</w:t>
+      </w:r>
+      <w:r>
+        <w:t xml:space="preserve"> </w:t>
+      </w:r>
+      <w:r>
+        <w:t>перечень</w:t>
+      </w:r>
+      <w:r>
+        <w:t>: '</w:t>
+      </w:r>
+      <w:r>
+        <w:rPr>
+          <w:lang w:val="en-US"/>
+        </w:rPr>
+        <w:t>CC</w:t>
+      </w:r>
+      <w:r>
+        <w:t>0', '</w:t>
+      </w:r>
+      <w:r>
+        <w:rPr>
+          <w:lang w:val="en-US"/>
+        </w:rPr>
+        <w:t>CC</w:t>
+      </w:r>
+      <w:r>
+        <w:t xml:space="preserve"> </w:t>
+      </w:r>
+      <w:r>
+        <w:rPr>
+          <w:lang w:val="en-US"/>
+        </w:rPr>
+        <w:t>BY</w:t>
+      </w:r>
+      <w:r>
+        <w:t>', '</w:t>
+      </w:r>
+      <w:r>
+        <w:rPr>
+          <w:lang w:val="en-US"/>
+        </w:rPr>
+        <w:t>CC</w:t>
+      </w:r>
+      <w:r>
+        <w:t xml:space="preserve"> </w:t>
+      </w:r>
+      <w:r>
+        <w:rPr>
+          <w:lang w:val="en-US"/>
+        </w:rPr>
+        <w:t>BY</w:t>
+      </w:r>
+      <w:r>
+        <w:t>-</w:t>
+      </w:r>
+      <w:r>
+        <w:rPr>
+          <w:lang w:val="en-US"/>
+        </w:rPr>
+        <w:t>SA</w:t>
+      </w:r>
+      <w:r>
+        <w:t>', '</w:t>
+      </w:r>
+      <w:r>
+        <w:rPr>
+          <w:lang w:val="en-US"/>
+        </w:rPr>
+        <w:t>CC</w:t>
+      </w:r>
+      <w:r>
+        <w:t xml:space="preserve"> </w:t>
+      </w:r>
+      <w:r>
+        <w:rPr>
+          <w:lang w:val="en-US"/>
+        </w:rPr>
+        <w:t>BY</w:t>
+      </w:r>
+      <w:r>
+        <w:t>-</w:t>
+      </w:r>
+      <w:r>
+        <w:rPr>
+          <w:lang w:val="en-US"/>
+        </w:rPr>
+        <w:t>ND</w:t>
+      </w:r>
+      <w:r>
+        <w:t>', '</w:t>
+      </w:r>
+      <w:r>
+        <w:rPr>
+          <w:lang w:val="en-US"/>
+        </w:rPr>
+        <w:t>CC</w:t>
+      </w:r>
+      <w:r>
+        <w:t xml:space="preserve"> </w:t>
+      </w:r>
+      <w:r>
+        <w:rPr>
+          <w:lang w:val="en-US"/>
+        </w:rPr>
+        <w:t>BY</w:t>
+      </w:r>
+      <w:r>
+        <w:t>-</w:t>
+      </w:r>
+      <w:r>
+        <w:rPr>
+          <w:lang w:val="en-US"/>
+        </w:rPr>
+        <w:t>NC</w:t>
+      </w:r>
+      <w:r>
+        <w:t>', '</w:t>
+      </w:r>
+      <w:r>
+        <w:rPr>
+          <w:lang w:val="en-US"/>
+        </w:rPr>
+        <w:t>CC</w:t>
+      </w:r>
+      <w:r>
+        <w:t xml:space="preserve"> </w:t>
+      </w:r>
+      <w:r>
+        <w:rPr>
+          <w:lang w:val="en-US"/>
+        </w:rPr>
+        <w:t>BY</w:t>
+      </w:r>
+      <w:r>
+        <w:t>-</w:t>
+      </w:r>
+      <w:r>
+        <w:rPr>
+          <w:lang w:val="en-US"/>
+        </w:rPr>
+        <w:t>NC</w:t>
+      </w:r>
+      <w:r>
+        <w:t>-</w:t>
+      </w:r>
+      <w:r>
+        <w:rPr>
+          <w:lang w:val="en-US"/>
+        </w:rPr>
+        <w:t>SA</w:t>
+      </w:r>
+      <w:r>
+        <w:t>', '</w:t>
+      </w:r>
+      <w:r>
+        <w:rPr>
+          <w:lang w:val="en-US"/>
+        </w:rPr>
+        <w:t>CC</w:t>
+      </w:r>
+      <w:r>
+        <w:t xml:space="preserve"> </w:t>
+      </w:r>
+      <w:r>
+        <w:rPr>
+          <w:lang w:val="en-US"/>
+        </w:rPr>
+        <w:t>BY</w:t>
+      </w:r>
+      <w:r>
+        <w:t>-</w:t>
+      </w:r>
+      <w:r>
+        <w:rPr>
+          <w:lang w:val="en-US"/>
+        </w:rPr>
+        <w:t>NC</w:t>
+      </w:r>
+      <w:r>
+        <w:t>-</w:t>
+      </w:r>
+      <w:r>
+        <w:rPr>
+          <w:lang w:val="en-US"/>
+        </w:rPr>
+        <w:t>ND</w:t>
+      </w:r>
+      <w:r>
+        <w:t>', '</w:t>
+      </w:r>
+      <w:r>
+        <w:t>Полная</w:t>
+      </w:r>
+      <w:r>
+        <w:t>', '</w:t>
+      </w:r>
+      <w:r>
+        <w:rPr>
+          <w:lang w:val="en-US"/>
+        </w:rPr>
+        <w:t>VOD</w:t>
+      </w:r>
+      <w:r>
+        <w:t>', '</w:t>
+      </w:r>
+      <w:r>
+        <w:t>ТВ</w:t>
+      </w:r>
+      <w:r>
+        <w:t>', '</w:t>
+      </w:r>
+      <w:r>
+        <w:t>Театральный</w:t>
+      </w:r>
+      <w:r>
+        <w:t xml:space="preserve"> </w:t>
+      </w:r>
+      <w:r>
+        <w:t>прокат</w:t>
+      </w:r>
+      <w:r>
+        <w:t>',</w:t>
+      </w:r>
+      <w:r>
+        <w:t xml:space="preserve"> </w:t>
+      </w:r>
+      <w:r>
+        <w:t>'Ограниченная', 'Эксклюзивная', ' Неисключительная', 'Сублицензия'.</w:t>
+      </w:r>
+    </w:p>
+    <w:p>
+      <w:pPr>
+        <w:pStyle w:val="a1"/>
+      </w:pPr>
+      <w:proofErr w:type="spellStart"/>
+      <w:r>
+        <w:t>CK_Договор_Номер</w:t>
+      </w:r>
+      <w:proofErr w:type="spellEnd"/>
+      <w:r>
+        <w:t xml:space="preserve"> – номер договора должен соответствовать</w:t>
+      </w:r>
+      <w:r>
+        <w:t xml:space="preserve"> </w:t>
+      </w:r>
+      <w:r>
+        <w:t>формату «Две заглавные русские буквы – четыре цифры года / пять цифр</w:t>
+      </w:r>
+      <w:r>
+        <w:t xml:space="preserve"> </w:t>
+      </w:r>
+      <w:r>
+        <w:t>порядкового номера» (например, ЛД-2026/00001).</w:t>
+      </w:r>
+    </w:p>
+    <w:p>
+      <w:pPr>
+        <w:pStyle w:val="a1"/>
+      </w:pPr>
+      <w:proofErr w:type="spellStart"/>
+      <w:r>
+        <w:t>CK_Договор_Путь</w:t>
+      </w:r>
+      <w:proofErr w:type="spellEnd"/>
+      <w:r>
+        <w:t xml:space="preserve"> – если путь к скану договора указан, он должен</w:t>
+      </w:r>
+      <w:r>
+        <w:t xml:space="preserve"> </w:t>
+      </w:r>
+      <w:r>
+        <w:t>оканчиваться на «.</w:t>
+      </w:r>
+      <w:proofErr w:type="spellStart"/>
+      <w:r>
+        <w:t>pdf</w:t>
+      </w:r>
+      <w:proofErr w:type="spellEnd"/>
+      <w:r>
+        <w:t>». Пустое значение допускается.</w:t>
+      </w:r>
+    </w:p>
+    <w:p>
+      <w:pPr>
+        <w:pStyle w:val="a4"/>
+      </w:pPr>
+      <w:r>
+        <w:t xml:space="preserve">Поле </w:t>
+      </w:r>
+      <w:proofErr w:type="spellStart"/>
+      <w:r>
+        <w:t>территория_действия</w:t>
+      </w:r>
+      <w:proofErr w:type="spellEnd"/>
+      <w:r>
+        <w:t xml:space="preserve"> содержит название одной страны (например,</w:t>
+      </w:r>
+      <w:r>
+        <w:t xml:space="preserve"> </w:t>
+      </w:r>
+      <w:r>
+        <w:t>«Россия» или «США»). Бизнес-правило предполагает, что одна лицензия</w:t>
+      </w:r>
+      <w:r>
+        <w:t xml:space="preserve"> </w:t>
+      </w:r>
+      <w:r>
+        <w:t>действует только на одной территории. В рамках данной лабораторной работы</w:t>
+      </w:r>
+      <w:r>
+        <w:t xml:space="preserve"> </w:t>
+      </w:r>
+      <w:r>
+        <w:t>это правило не формализовано в виде CHECK-ограничения, однако</w:t>
+      </w:r>
+      <w:r>
+        <w:t xml:space="preserve"> </w:t>
+      </w:r>
+      <w:r>
+        <w:t>учитывается при заполнении данных.</w:t>
+      </w:r>
+    </w:p>
+    <w:p>
+      <w:pPr>
+        <w:rPr>
+          <w:rFonts w:ascii="Times New Roman" w:eastAsia="Times New Roman" w:hAnsi="Times New Roman" w:cs="Times New Roman"/>
+          <w:sz w:val="28"/>
+          <w:szCs w:val="24"/>
+        </w:rPr>
+      </w:pPr>
+      <w:r>
+        <w:br w:type="page"/>
+      </w:r>
+    </w:p>
+    <w:p>
+      <w:pPr>
+        <w:pStyle w:val="2"/>
+      </w:pPr>
+      <w:r>
+        <w:lastRenderedPageBreak/>
+        <w:t>3.4 Таблица Лицензия</w:t>
+      </w:r>
+    </w:p>
+    <w:p>
+      <w:pPr>
+        <w:pStyle w:val="a4"/>
+      </w:pPr>
+    </w:p>
+    <w:p>
+      <w:pPr>
+        <w:pStyle w:val="a4"/>
+      </w:pPr>
+      <w:r>
+        <w:t xml:space="preserve">Для данной таблицы существует ограничение </w:t>
+      </w:r>
+      <w:proofErr w:type="spellStart"/>
+      <w:r>
+        <w:t>CK_Лицензия_Даты</w:t>
+      </w:r>
+      <w:proofErr w:type="spellEnd"/>
+      <w:r>
+        <w:t>, которое гарантирует, что дата начала действия лицензии не может быть позже даты окончания.</w:t>
+      </w:r>
+    </w:p>
+    <w:p>
+      <w:pPr>
+        <w:pStyle w:val="2"/>
         <w:rPr>
           <w:rFonts w:eastAsia="Times New Roman"/>
         </w:rPr>
@@ -2949,8 +3387,16 @@
         <w:rPr>
           <w:rFonts w:eastAsia="Times New Roman"/>
         </w:rPr>
-        <w:t>3.3 Таблица Договор</w:t>
-      </w:r>
+        <w:t xml:space="preserve">3.5 Таблица </w:t>
+      </w:r>
+      <w:proofErr w:type="spellStart"/>
+      <w:r>
+        <w:rPr>
+          <w:rFonts w:eastAsia="Times New Roman"/>
+        </w:rPr>
+        <w:t>Медиа_файл</w:t>
+      </w:r>
+      <w:proofErr w:type="spellEnd"/>
     </w:p>
     <w:p>
       <w:pPr>
@@ -2962,7 +3408,7 @@
         <w:pStyle w:val="a4"/>
       </w:pPr>
       <w:r>
-        <w:t>На таблицу наложены следующие CHECK-ограничения:</w:t>
+        <w:t>Для таблицы установлены три проверочных ограничения:</w:t>
       </w:r>
     </w:p>
     <w:p>
@@ -2971,17 +3417,67 @@
       </w:pPr>
       <w:proofErr w:type="spellStart"/>
       <w:r>
-        <w:t>CK_Договор_Тип_лицензии</w:t>
+        <w:t>CK_Медиа_файл_Тип</w:t>
       </w:r>
       <w:proofErr w:type="spellEnd"/>
       <w:r>
-        <w:t> – тип лицензии должен входить в перечень: 'CC0', 'CC BY', 'CC BY-SA', 'CC BY-ND', 'CC BY-NC', 'CC BY-NC-SA', 'CC BY-NC-ND', 'Полная', 'VOD', 'ТВ', 'Театральный прокат', 'Ограниченная', 'Эксклюзивная', '</w:t>
-      </w:r>
-      <w:r>
-        <w:t xml:space="preserve"> </w:t>
-      </w:r>
-      <w:r>
-        <w:t>Неисключительная', 'Сублицензия'.</w:t>
+        <w:t> – тип файла должен быть одним из видеоформатов: 'mp4', '</w:t>
+      </w:r>
+      <w:proofErr w:type="spellStart"/>
+      <w:r>
+        <w:t>avi</w:t>
+      </w:r>
+      <w:proofErr w:type="spellEnd"/>
+      <w:r>
+        <w:t>', '</w:t>
+      </w:r>
+      <w:proofErr w:type="spellStart"/>
+      <w:r>
+        <w:t>mkv</w:t>
+      </w:r>
+      <w:proofErr w:type="spellEnd"/>
+      <w:r>
+        <w:t>', '</w:t>
+      </w:r>
+      <w:proofErr w:type="spellStart"/>
+      <w:r>
+        <w:t>mov</w:t>
+      </w:r>
+      <w:proofErr w:type="spellEnd"/>
+      <w:r>
+        <w:t>', '</w:t>
+      </w:r>
+      <w:proofErr w:type="spellStart"/>
+      <w:r>
+        <w:t>avc</w:t>
+      </w:r>
+      <w:proofErr w:type="spellEnd"/>
+      <w:r>
+        <w:t>', '</w:t>
+      </w:r>
+      <w:proofErr w:type="spellStart"/>
+      <w:r>
+        <w:t>hevc</w:t>
+      </w:r>
+      <w:proofErr w:type="spellEnd"/>
+      <w:r>
+        <w:t>', '</w:t>
+      </w:r>
+      <w:proofErr w:type="spellStart"/>
+      <w:r>
+        <w:t>wmv</w:t>
+      </w:r>
+      <w:proofErr w:type="spellEnd"/>
+      <w:r>
+        <w:t>', '</w:t>
+      </w:r>
+      <w:proofErr w:type="spellStart"/>
+      <w:r>
+        <w:t>flv</w:t>
+      </w:r>
+      <w:proofErr w:type="spellEnd"/>
+      <w:r>
+        <w:t>'.</w:t>
       </w:r>
     </w:p>
     <w:p>
@@ -2990,15 +3486,19 @@
       </w:pPr>
       <w:proofErr w:type="spellStart"/>
       <w:r>
-        <w:t>CK_Договор_Номер</w:t>
+        <w:t>CK_Медиа_файл_Качество</w:t>
       </w:r>
       <w:proofErr w:type="spellEnd"/>
       <w:r>
-        <w:t> – номер договора должен соответствовать формату «Две заглавные русские буквы – четыре цифры года / пять цифр порядкового номера» (например, ЛД</w:t>
-      </w:r>
-      <w:r>
-        <w:noBreakHyphen/>
-        <w:t>2026/00001).</w:t>
+        <w:t> – значение качества (если оно указано) может быть только 'SD', 'HD', '</w:t>
+      </w:r>
+      <w:proofErr w:type="spellStart"/>
+      <w:r>
+        <w:t>Full</w:t>
+      </w:r>
+      <w:proofErr w:type="spellEnd"/>
+      <w:r>
+        <w:t xml:space="preserve"> HD', '4K' или '8K'. NULL разрешён.</w:t>
       </w:r>
     </w:p>
     <w:p>
@@ -3007,111 +3507,116 @@
       </w:pPr>
       <w:proofErr w:type="spellStart"/>
       <w:r>
-        <w:t>CK_Договор_Путь</w:t>
+        <w:t>CK_Медиа_файл_Размер</w:t>
       </w:r>
       <w:proofErr w:type="spellEnd"/>
       <w:r>
-        <w:t> – если путь к скану договора указан, он должен оканчиваться на «.</w:t>
+        <w:t> – размер файла в байтах не может быть отрицательным и не должен превышать 2 147 483 648 (2 ГБ). NULL допустим.</w:t>
+      </w:r>
+    </w:p>
+    <w:p>
+      <w:pPr>
+        <w:pStyle w:val="a4"/>
+      </w:pPr>
+      <w:r>
+        <w:t xml:space="preserve">В таблице «Лицензия» для поля </w:t>
       </w:r>
       <w:proofErr w:type="spellStart"/>
       <w:r>
-        <w:t>pdf</w:t>
+        <w:t>дата_добавления</w:t>
       </w:r>
       <w:proofErr w:type="spellEnd"/>
       <w:r>
-        <w:t>». Пустое значение допускается.</w:t>
+        <w:t xml:space="preserve"> задано значение по умолчанию – текущая дата (</w:t>
+      </w:r>
+      <w:proofErr w:type="gramStart"/>
+      <w:r>
+        <w:t>GETDATE(</w:t>
+      </w:r>
+      <w:proofErr w:type="gramEnd"/>
+      <w:r>
+        <w:t>)). Таким образом, при вставке новой записи без явного указания этой даты она будет проставлена автоматически.</w:t>
+      </w:r>
+    </w:p>
+    <w:p>
+      <w:pPr>
+        <w:rPr>
+          <w:rFonts w:ascii="Times New Roman" w:eastAsia="Times New Roman" w:hAnsi="Times New Roman" w:cs="Times New Roman"/>
+          <w:sz w:val="28"/>
+          <w:szCs w:val="24"/>
+        </w:rPr>
+      </w:pPr>
+      <w:r>
+        <w:br w:type="page"/>
+      </w:r>
+    </w:p>
+    <w:p>
+      <w:pPr>
+        <w:pStyle w:val="2"/>
+        <w:rPr>
+          <w:rFonts w:eastAsia="Times New Roman"/>
+        </w:rPr>
+      </w:pPr>
+      <w:r>
+        <w:rPr>
+          <w:rFonts w:eastAsia="Times New Roman"/>
+        </w:rPr>
+        <w:lastRenderedPageBreak/>
+        <w:t>3.</w:t>
+      </w:r>
+      <w:r>
+        <w:rPr>
+          <w:rFonts w:eastAsia="Times New Roman"/>
+        </w:rPr>
+        <w:t>6</w:t>
+      </w:r>
+      <w:r>
+        <w:rPr>
+          <w:rFonts w:eastAsia="Times New Roman"/>
+        </w:rPr>
+        <w:t xml:space="preserve"> Внешние ключи</w:t>
       </w:r>
     </w:p>
     <w:p>
       <w:pPr>
         <w:pStyle w:val="a4"/>
       </w:pPr>
-      <w:r>
-        <w:t xml:space="preserve">Поле </w:t>
-      </w:r>
+    </w:p>
+    <w:p>
+      <w:pPr>
+        <w:pStyle w:val="a4"/>
+      </w:pPr>
+      <w:r>
+        <w:t>Для поддержки ссылочной целостности созданы следующие внешние ключи:</w:t>
+      </w:r>
+    </w:p>
+    <w:p>
+      <w:pPr>
+        <w:pStyle w:val="a1"/>
+      </w:pPr>
       <w:proofErr w:type="spellStart"/>
       <w:r>
-        <w:t>территория_действия</w:t>
+        <w:t>FK_Договор_Правообладатель</w:t>
       </w:r>
       <w:proofErr w:type="spellEnd"/>
       <w:r>
-        <w:t xml:space="preserve"> содержит название одной страны (например, «Россия» или «США»). Бизнес-правило предполагает, что одна лицензия действует только на одной территории. В рамках данной лабораторной работы это правило не формализовано в виде CHECK-ограничения, однако учитывается при заполнении данных.</w:t>
-      </w:r>
-    </w:p>
-    <w:p>
-      <w:pPr>
-        <w:pStyle w:val="a4"/>
-      </w:pPr>
-    </w:p>
-    <w:p>
-      <w:pPr>
-        <w:pStyle w:val="2"/>
-      </w:pPr>
-      <w:r>
-        <w:t>3.4 Таблица Лицензия</w:t>
-      </w:r>
-    </w:p>
-    <w:p>
-      <w:pPr>
-        <w:pStyle w:val="a4"/>
-      </w:pPr>
-    </w:p>
-    <w:p>
-      <w:pPr>
-        <w:pStyle w:val="a4"/>
-      </w:pPr>
-      <w:r>
-        <w:t>Для данной таблицы существует о</w:t>
-      </w:r>
-      <w:r>
-        <w:t xml:space="preserve">граничение </w:t>
+        <w:t> – связывает таблицу «Договор» (поле </w:t>
       </w:r>
       <w:proofErr w:type="spellStart"/>
       <w:r>
-        <w:t>CK_Лицензия_Даты</w:t>
+        <w:t>ID_правообладателя</w:t>
       </w:r>
       <w:proofErr w:type="spellEnd"/>
       <w:r>
-        <w:t>, которое</w:t>
-      </w:r>
-      <w:r>
-        <w:t xml:space="preserve"> гарантирует, что дата начала действия лицензии не может быть позже даты окончания.</w:t>
-      </w:r>
-    </w:p>
-    <w:p>
-      <w:pPr>
-        <w:pStyle w:val="2"/>
-        <w:rPr>
-          <w:rFonts w:eastAsia="Times New Roman"/>
-        </w:rPr>
-      </w:pPr>
-      <w:r>
-        <w:rPr>
-          <w:rFonts w:eastAsia="Times New Roman"/>
-        </w:rPr>
-        <w:lastRenderedPageBreak/>
-        <w:t xml:space="preserve">3.5 Таблица </w:t>
+        <w:t>) с таблицей «Правообладатель» (поле </w:t>
       </w:r>
       <w:proofErr w:type="spellStart"/>
       <w:r>
-        <w:rPr>
-          <w:rFonts w:eastAsia="Times New Roman"/>
-        </w:rPr>
-        <w:t>Медиа_файл</w:t>
+        <w:t>ID_правообладателя</w:t>
       </w:r>
       <w:proofErr w:type="spellEnd"/>
-    </w:p>
-    <w:p>
-      <w:pPr>
-        <w:pStyle w:val="a4"/>
-      </w:pPr>
-    </w:p>
-    <w:p>
-      <w:pPr>
-        <w:pStyle w:val="a4"/>
-      </w:pPr>
-      <w:r>
-        <w:t>Для таблицы установлены три проверочных ограничения:</w:t>
+      <w:r>
+        <w:t>). Каждый договор обязательно относится к существующему правообладателю.</w:t>
       </w:r>
     </w:p>
     <w:p>
@@ -3120,289 +3625,85 @@
       </w:pPr>
       <w:proofErr w:type="spellStart"/>
       <w:r>
-        <w:t>CK_Медиа_файл_Тип</w:t>
+        <w:t>FK_Лицензия_Договор</w:t>
       </w:r>
       <w:proofErr w:type="spellEnd"/>
       <w:r>
-        <w:t> – тип файла должен быть одним из видеоформатов: 'mp4', '</w:t>
+        <w:t> – связывает таблицу «Лицензия» (поле </w:t>
       </w:r>
       <w:proofErr w:type="spellStart"/>
       <w:r>
-        <w:t>avi</w:t>
+        <w:t>ID_договора</w:t>
       </w:r>
       <w:proofErr w:type="spellEnd"/>
       <w:r>
-        <w:t>', '</w:t>
+        <w:t>) с таблицей «Договор» (поле </w:t>
       </w:r>
       <w:proofErr w:type="spellStart"/>
       <w:r>
-        <w:t>mkv</w:t>
+        <w:t>номер_договора</w:t>
       </w:r>
       <w:proofErr w:type="spellEnd"/>
       <w:r>
-        <w:t>', '</w:t>
-      </w:r>
+        <w:t>). Каждая лицензия привязана к действующему договору.</w:t>
+      </w:r>
+    </w:p>
+    <w:p>
+      <w:pPr>
+        <w:pStyle w:val="a1"/>
+      </w:pPr>
       <w:proofErr w:type="spellStart"/>
       <w:r>
-        <w:t>mov</w:t>
+        <w:t>FK_Лицензия_Контент</w:t>
       </w:r>
       <w:proofErr w:type="spellEnd"/>
       <w:r>
-        <w:t>', '</w:t>
+        <w:t> – связывает таблицу «Лицензия» (поле </w:t>
       </w:r>
       <w:proofErr w:type="spellStart"/>
       <w:r>
-        <w:t>avc</w:t>
+        <w:t>ID_контента</w:t>
       </w:r>
       <w:proofErr w:type="spellEnd"/>
       <w:r>
-        <w:t>', '</w:t>
+        <w:t>) с таблицей «Контент» (поле </w:t>
       </w:r>
       <w:proofErr w:type="spellStart"/>
       <w:r>
-        <w:t>hevc</w:t>
+        <w:t>ID_контента</w:t>
       </w:r>
       <w:proofErr w:type="spellEnd"/>
       <w:r>
-        <w:t>', '</w:t>
-      </w:r>
+        <w:t>). Лицензия относится к конкретному контенту.</w:t>
+      </w:r>
+    </w:p>
+    <w:p>
+      <w:pPr>
+        <w:pStyle w:val="a1"/>
+      </w:pPr>
       <w:proofErr w:type="spellStart"/>
       <w:r>
-        <w:t>wmv</w:t>
+        <w:t>FK_Контент_Жанр_Контент</w:t>
       </w:r>
       <w:proofErr w:type="spellEnd"/>
       <w:r>
-        <w:t>', '</w:t>
+        <w:t> и </w:t>
       </w:r>
       <w:proofErr w:type="spellStart"/>
       <w:r>
-        <w:t>flv</w:t>
+        <w:t>FK_Контент_Жанр_Жанр</w:t>
       </w:r>
       <w:proofErr w:type="spellEnd"/>
       <w:r>
-        <w:t>'.</w:t>
-      </w:r>
-    </w:p>
-    <w:p>
-      <w:pPr>
-        <w:pStyle w:val="a1"/>
-      </w:pPr>
+        <w:t> – обеспечивают связь таблицы «</w:t>
+      </w:r>
       <w:proofErr w:type="spellStart"/>
       <w:r>
-        <w:t>CK_Медиа_файл_Качество</w:t>
+        <w:t>Контент_Жанр</w:t>
       </w:r>
       <w:proofErr w:type="spellEnd"/>
       <w:r>
-        <w:t> – значение качества (если оно указано) может быть только 'SD', 'HD', '</w:t>
-      </w:r>
-      <w:proofErr w:type="spellStart"/>
-      <w:r>
-        <w:t>Full</w:t>
-      </w:r>
-      <w:proofErr w:type="spellEnd"/>
-      <w:r>
-        <w:t xml:space="preserve"> HD', '4K' или '8K'. NULL разрешён.</w:t>
-      </w:r>
-    </w:p>
-    <w:p>
-      <w:pPr>
-        <w:pStyle w:val="a1"/>
-      </w:pPr>
-      <w:proofErr w:type="spellStart"/>
-      <w:r>
-        <w:t>CK_Медиа_файл_Размер</w:t>
-      </w:r>
-      <w:proofErr w:type="spellEnd"/>
-      <w:r>
-        <w:t> – размер файла в байтах не может быть отрицательным и не должен превышать 2 147 483 648 (2 ГБ). NULL допустим.</w:t>
-      </w:r>
-    </w:p>
-    <w:p>
-      <w:pPr>
-        <w:pStyle w:val="a4"/>
-      </w:pPr>
-      <w:r>
-        <w:t xml:space="preserve">В таблице «Лицензия» для поля </w:t>
-      </w:r>
-      <w:proofErr w:type="spellStart"/>
-      <w:r>
-        <w:t>дата_добавления</w:t>
-      </w:r>
-      <w:proofErr w:type="spellEnd"/>
-      <w:r>
-        <w:t xml:space="preserve"> задано значение по умолчанию – текущая дата (</w:t>
-      </w:r>
-      <w:proofErr w:type="gramStart"/>
-      <w:r>
-        <w:t>GETDATE(</w:t>
-      </w:r>
-      <w:proofErr w:type="gramEnd"/>
-      <w:r>
-        <w:t>)). Таким образом, при вставке новой записи без явного указания этой даты она будет проставлена автоматически.</w:t>
-      </w:r>
-    </w:p>
-    <w:p>
-      <w:pPr>
-        <w:pStyle w:val="a4"/>
-      </w:pPr>
-    </w:p>
-    <w:p>
-      <w:pPr>
-        <w:pStyle w:val="2"/>
-        <w:rPr>
-          <w:rFonts w:eastAsia="Times New Roman"/>
-        </w:rPr>
-      </w:pPr>
-      <w:r>
-        <w:rPr>
-          <w:rFonts w:eastAsia="Times New Roman"/>
-        </w:rPr>
-        <w:t>3.</w:t>
-      </w:r>
-      <w:r>
-        <w:rPr>
-          <w:rFonts w:eastAsia="Times New Roman"/>
-        </w:rPr>
-        <w:t>6</w:t>
-      </w:r>
-      <w:r>
-        <w:rPr>
-          <w:rFonts w:eastAsia="Times New Roman"/>
-        </w:rPr>
-        <w:t xml:space="preserve"> Внешние ключи</w:t>
-      </w:r>
-    </w:p>
-    <w:p>
-      <w:pPr>
-        <w:pStyle w:val="a4"/>
-      </w:pPr>
-    </w:p>
-    <w:p>
-      <w:pPr>
-        <w:pStyle w:val="a4"/>
-      </w:pPr>
-      <w:r>
-        <w:t>Для поддержки ссылочной целостности созданы следующие внешние ключи:</w:t>
-      </w:r>
-    </w:p>
-    <w:p>
-      <w:pPr>
-        <w:pStyle w:val="a1"/>
-      </w:pPr>
-      <w:proofErr w:type="spellStart"/>
-      <w:r>
-        <w:t>FK_Договор_Правообладатель</w:t>
-      </w:r>
-      <w:proofErr w:type="spellEnd"/>
-      <w:r>
-        <w:t> – связывает таблицу «Договор» (поле </w:t>
-      </w:r>
-      <w:proofErr w:type="spellStart"/>
-      <w:r>
-        <w:t>ID_правообладателя</w:t>
-      </w:r>
-      <w:proofErr w:type="spellEnd"/>
-      <w:r>
-        <w:t>) с таблицей «Правообладатель» (поле </w:t>
-      </w:r>
-      <w:proofErr w:type="spellStart"/>
-      <w:r>
-        <w:t>ID_правообладателя</w:t>
-      </w:r>
-      <w:proofErr w:type="spellEnd"/>
-      <w:r>
-        <w:t>). Каждый договор обязательно относится к существующему правообладателю.</w:t>
-      </w:r>
-    </w:p>
-    <w:p>
-      <w:pPr>
-        <w:pStyle w:val="a1"/>
-      </w:pPr>
-      <w:proofErr w:type="spellStart"/>
-      <w:r>
-        <w:t>FK_Лицензия_Договор</w:t>
-      </w:r>
-      <w:proofErr w:type="spellEnd"/>
-      <w:r>
-        <w:t> – связывает таблицу «Лицензия» (поле </w:t>
-      </w:r>
-      <w:proofErr w:type="spellStart"/>
-      <w:r>
-        <w:t>ID_договора</w:t>
-      </w:r>
-      <w:proofErr w:type="spellEnd"/>
-      <w:r>
-        <w:t>) с таблицей «Договор» (поле </w:t>
-      </w:r>
-      <w:proofErr w:type="spellStart"/>
-      <w:r>
-        <w:t>номер_договора</w:t>
-      </w:r>
-      <w:proofErr w:type="spellEnd"/>
-      <w:r>
-        <w:t>). Каждая лицензия привязана к действующему договору.</w:t>
-      </w:r>
-    </w:p>
-    <w:p>
-      <w:pPr>
-        <w:pStyle w:val="a1"/>
-      </w:pPr>
-      <w:proofErr w:type="spellStart"/>
-      <w:r>
-        <w:t>FK_Лицензия_Контент</w:t>
-      </w:r>
-      <w:proofErr w:type="spellEnd"/>
-      <w:r>
-        <w:t> – связывает таблицу «Лицензия» (поле </w:t>
-      </w:r>
-      <w:proofErr w:type="spellStart"/>
-      <w:r>
-        <w:t>ID_контента</w:t>
-      </w:r>
-      <w:proofErr w:type="spellEnd"/>
-      <w:r>
-        <w:t>) с таблицей «Контент» (поле </w:t>
-      </w:r>
-      <w:proofErr w:type="spellStart"/>
-      <w:r>
-        <w:t>ID_контента</w:t>
-      </w:r>
-      <w:proofErr w:type="spellEnd"/>
-      <w:r>
-        <w:t>). Лицензия относится к конкретному контенту.</w:t>
-      </w:r>
-    </w:p>
-    <w:p>
-      <w:pPr>
-        <w:pStyle w:val="a1"/>
-      </w:pPr>
-      <w:proofErr w:type="spellStart"/>
-      <w:r>
-        <w:t>FK_Контент_Жанр_Контент</w:t>
-      </w:r>
-      <w:proofErr w:type="spellEnd"/>
-      <w:r>
-        <w:t> и </w:t>
-      </w:r>
-      <w:proofErr w:type="spellStart"/>
-      <w:r>
-        <w:t>FK_Контент_Жанр_Жанр</w:t>
-      </w:r>
-      <w:proofErr w:type="spellEnd"/>
-      <w:r>
-        <w:t> – обеспечивают связь таблицы «</w:t>
-      </w:r>
-      <w:proofErr w:type="spellStart"/>
-      <w:r>
-        <w:t>Контент_Жанр</w:t>
-      </w:r>
-      <w:proofErr w:type="spellEnd"/>
-      <w:r>
-        <w:t xml:space="preserve">» с таблицами «Контент» и </w:t>
-      </w:r>
-      <w:r>
-        <w:lastRenderedPageBreak/>
-        <w:t>«Жанр» соответственно. Они реализуют отношение «многие ко многим» между контентом и жанрами.</w:t>
+        <w:t>» с таблицами «Контент» и «Жанр» соответственно. Они реализуют отношение «многие ко многим» между контентом и жанрами.</w:t>
       </w:r>
     </w:p>
     <w:p>
@@ -3626,7 +3927,13 @@
         <w:rPr>
           <w:lang w:eastAsia="ru-RU"/>
         </w:rPr>
-        <w:t>заполненная таблица Правообладатель</w:t>
+        <w:t>З</w:t>
+      </w:r>
+      <w:r>
+        <w:rPr>
+          <w:lang w:eastAsia="ru-RU"/>
+        </w:rPr>
+        <w:t>аполненная таблица Правообладатель</w:t>
       </w:r>
     </w:p>
     <w:p>
@@ -3728,13 +4035,19 @@
         <w:rPr>
           <w:lang w:eastAsia="ru-RU"/>
         </w:rPr>
-        <w:t xml:space="preserve"> – </w:t>
-      </w:r>
-      <w:r>
-        <w:rPr>
-          <w:lang w:eastAsia="ru-RU"/>
-        </w:rPr>
-        <w:t>заполненная таблица Договор</w:t>
+        <w:t xml:space="preserve"> –</w:t>
+      </w:r>
+      <w:r>
+        <w:rPr>
+          <w:lang w:eastAsia="ru-RU"/>
+        </w:rPr>
+        <w:t>З</w:t>
+      </w:r>
+      <w:r>
+        <w:rPr>
+          <w:lang w:eastAsia="ru-RU"/>
+        </w:rPr>
+        <w:t>аполненная таблица Договор</w:t>
       </w:r>
     </w:p>
     <w:p>
@@ -3842,7 +4155,13 @@
         <w:rPr>
           <w:lang w:eastAsia="ru-RU"/>
         </w:rPr>
-        <w:t>заполненная таблица Жанр</w:t>
+        <w:t>З</w:t>
+      </w:r>
+      <w:r>
+        <w:rPr>
+          <w:lang w:eastAsia="ru-RU"/>
+        </w:rPr>
+        <w:t>аполненная таблица Жанр</w:t>
       </w:r>
     </w:p>
     <w:p>
@@ -3864,10 +4183,10 @@
           <w:noProof/>
         </w:rPr>
         <w:drawing>
-          <wp:inline distT="0" distB="0" distL="0" distR="0" wp14:anchorId="6F0BABAF" wp14:editId="03EF4945">
-            <wp:extent cx="5939790" cy="784860"/>
-            <wp:effectExtent l="0" t="0" r="3810" b="0"/>
-            <wp:docPr id="13" name="Рисунок 13"/>
+          <wp:inline distT="0" distB="0" distL="0" distR="0" wp14:anchorId="79AAF2B9" wp14:editId="5A3918DD">
+            <wp:extent cx="5939790" cy="779145"/>
+            <wp:effectExtent l="0" t="0" r="3810" b="1905"/>
+            <wp:docPr id="20" name="Рисунок 20"/>
             <wp:cNvGraphicFramePr>
               <a:graphicFrameLocks xmlns:a="http://schemas.openxmlformats.org/drawingml/2006/main" noChangeAspect="1"/>
             </wp:cNvGraphicFramePr>
@@ -3875,7 +4194,7 @@
               <a:graphicData uri="http://schemas.openxmlformats.org/drawingml/2006/picture">
                 <pic:pic xmlns:pic="http://schemas.openxmlformats.org/drawingml/2006/picture">
                   <pic:nvPicPr>
-                    <pic:cNvPr id="13" name="Table Контент.PNG"/>
+                    <pic:cNvPr id="20" name="Table_Контент.PNG"/>
                     <pic:cNvPicPr/>
                   </pic:nvPicPr>
                   <pic:blipFill>
@@ -3893,7 +4212,7 @@
                   <pic:spPr>
                     <a:xfrm>
                       <a:off x="0" y="0"/>
-                      <a:ext cx="5939790" cy="784860"/>
+                      <a:ext cx="5939790" cy="779145"/>
                     </a:xfrm>
                     <a:prstGeom prst="rect">
                       <a:avLst/>
@@ -3950,7 +4269,13 @@
         <w:rPr>
           <w:lang w:eastAsia="ru-RU"/>
         </w:rPr>
-        <w:t>заполненная таблица Контент</w:t>
+        <w:t>З</w:t>
+      </w:r>
+      <w:r>
+        <w:rPr>
+          <w:lang w:eastAsia="ru-RU"/>
+        </w:rPr>
+        <w:t>аполненная таблица Контент</w:t>
       </w:r>
     </w:p>
     <w:p>
@@ -4058,7 +4383,13 @@
         <w:rPr>
           <w:lang w:eastAsia="ru-RU"/>
         </w:rPr>
-        <w:t>заполненная таблица Лицензия</w:t>
+        <w:t>З</w:t>
+      </w:r>
+      <w:r>
+        <w:rPr>
+          <w:lang w:eastAsia="ru-RU"/>
+        </w:rPr>
+        <w:t>аполненная таблица Лицензия</w:t>
       </w:r>
     </w:p>
     <w:p>
@@ -4166,7 +4497,13 @@
         <w:rPr>
           <w:lang w:eastAsia="ru-RU"/>
         </w:rPr>
-        <w:t xml:space="preserve">заполненная таблица </w:t>
+        <w:t>З</w:t>
+      </w:r>
+      <w:r>
+        <w:rPr>
+          <w:lang w:eastAsia="ru-RU"/>
+        </w:rPr>
+        <w:t xml:space="preserve">аполненная таблица </w:t>
       </w:r>
       <w:proofErr w:type="spellStart"/>
       <w:r>
@@ -4282,7 +4619,13 @@
         <w:rPr>
           <w:lang w:eastAsia="ru-RU"/>
         </w:rPr>
-        <w:t xml:space="preserve">заполненная таблица </w:t>
+        <w:t>З</w:t>
+      </w:r>
+      <w:r>
+        <w:rPr>
+          <w:lang w:eastAsia="ru-RU"/>
+        </w:rPr>
+        <w:t xml:space="preserve">аполненная таблица </w:t>
       </w:r>
       <w:proofErr w:type="spellStart"/>
       <w:r>
@@ -4536,7 +4879,13 @@
         <w:rPr>
           <w:lang w:eastAsia="ru-RU"/>
         </w:rPr>
-        <w:t xml:space="preserve">ошибка </w:t>
+        <w:t>О</w:t>
+      </w:r>
+      <w:r>
+        <w:rPr>
+          <w:lang w:eastAsia="ru-RU"/>
+        </w:rPr>
+        <w:t xml:space="preserve">шибка </w:t>
       </w:r>
       <w:r>
         <w:rPr>
@@ -4707,7 +5056,7 @@
         <w:rPr>
           <w:lang w:eastAsia="ru-RU"/>
         </w:rPr>
-        <w:t>1</w:t>
+        <w:t>2</w:t>
       </w:r>
       <w:r>
         <w:rPr>
@@ -4719,7 +5068,13 @@
         <w:rPr>
           <w:lang w:eastAsia="ru-RU"/>
         </w:rPr>
-        <w:t xml:space="preserve">ошибка </w:t>
+        <w:t>О</w:t>
+      </w:r>
+      <w:r>
+        <w:rPr>
+          <w:lang w:eastAsia="ru-RU"/>
+        </w:rPr>
+        <w:t xml:space="preserve">шибка </w:t>
       </w:r>
       <w:r>
         <w:rPr>
@@ -7466,6 +7821,155 @@
     </w:lvl>
   </w:abstractNum>
   <w:abstractNum w:abstractNumId="17" w15:restartNumberingAfterBreak="0">
+    <w:nsid w:val="3B223429"/>
+    <w:multiLevelType w:val="multilevel"/>
+    <w:tmpl w:val="7B96CED6"/>
+    <w:lvl w:ilvl="0">
+      <w:start w:val="1"/>
+      <w:numFmt w:val="bullet"/>
+      <w:lvlText w:val=""/>
+      <w:lvlJc w:val="left"/>
+      <w:pPr>
+        <w:tabs>
+          <w:tab w:val="num" w:pos="720"/>
+        </w:tabs>
+        <w:ind w:left="720" w:hanging="360"/>
+      </w:pPr>
+      <w:rPr>
+        <w:rFonts w:ascii="Symbol" w:hAnsi="Symbol" w:hint="default"/>
+        <w:sz w:val="20"/>
+      </w:rPr>
+    </w:lvl>
+    <w:lvl w:ilvl="1" w:tentative="1">
+      <w:start w:val="1"/>
+      <w:numFmt w:val="bullet"/>
+      <w:lvlText w:val="o"/>
+      <w:lvlJc w:val="left"/>
+      <w:pPr>
+        <w:tabs>
+          <w:tab w:val="num" w:pos="1440"/>
+        </w:tabs>
+        <w:ind w:left="1440" w:hanging="360"/>
+      </w:pPr>
+      <w:rPr>
+        <w:rFonts w:ascii="Courier New" w:hAnsi="Courier New" w:hint="default"/>
+        <w:sz w:val="20"/>
+      </w:rPr>
+    </w:lvl>
+    <w:lvl w:ilvl="2" w:tentative="1">
+      <w:start w:val="1"/>
+      <w:numFmt w:val="bullet"/>
+      <w:lvlText w:val=""/>
+      <w:lvlJc w:val="left"/>
+      <w:pPr>
+        <w:tabs>
+          <w:tab w:val="num" w:pos="2160"/>
+        </w:tabs>
+        <w:ind w:left="2160" w:hanging="360"/>
+      </w:pPr>
+      <w:rPr>
+        <w:rFonts w:ascii="Wingdings" w:hAnsi="Wingdings" w:hint="default"/>
+        <w:sz w:val="20"/>
+      </w:rPr>
+    </w:lvl>
+    <w:lvl w:ilvl="3" w:tentative="1">
+      <w:start w:val="1"/>
+      <w:numFmt w:val="bullet"/>
+      <w:lvlText w:val=""/>
+      <w:lvlJc w:val="left"/>
+      <w:pPr>
+        <w:tabs>
+          <w:tab w:val="num" w:pos="2880"/>
+        </w:tabs>
+        <w:ind w:left="2880" w:hanging="360"/>
+      </w:pPr>
+      <w:rPr>
+        <w:rFonts w:ascii="Wingdings" w:hAnsi="Wingdings" w:hint="default"/>
+        <w:sz w:val="20"/>
+      </w:rPr>
+    </w:lvl>
+    <w:lvl w:ilvl="4" w:tentative="1">
+      <w:start w:val="1"/>
+      <w:numFmt w:val="bullet"/>
+      <w:lvlText w:val=""/>
+      <w:lvlJc w:val="left"/>
+      <w:pPr>
+        <w:tabs>
+          <w:tab w:val="num" w:pos="3600"/>
+        </w:tabs>
+        <w:ind w:left="3600" w:hanging="360"/>
+      </w:pPr>
+      <w:rPr>
+        <w:rFonts w:ascii="Wingdings" w:hAnsi="Wingdings" w:hint="default"/>
+        <w:sz w:val="20"/>
+      </w:rPr>
+    </w:lvl>
+    <w:lvl w:ilvl="5" w:tentative="1">
+      <w:start w:val="1"/>
+      <w:numFmt w:val="bullet"/>
+      <w:lvlText w:val=""/>
+      <w:lvlJc w:val="left"/>
+      <w:pPr>
+        <w:tabs>
+          <w:tab w:val="num" w:pos="4320"/>
+        </w:tabs>
+        <w:ind w:left="4320" w:hanging="360"/>
+      </w:pPr>
+      <w:rPr>
+        <w:rFonts w:ascii="Wingdings" w:hAnsi="Wingdings" w:hint="default"/>
+        <w:sz w:val="20"/>
+      </w:rPr>
+    </w:lvl>
+    <w:lvl w:ilvl="6" w:tentative="1">
+      <w:start w:val="1"/>
+      <w:numFmt w:val="bullet"/>
+      <w:lvlText w:val=""/>
+      <w:lvlJc w:val="left"/>
+      <w:pPr>
+        <w:tabs>
+          <w:tab w:val="num" w:pos="5040"/>
+        </w:tabs>
+        <w:ind w:left="5040" w:hanging="360"/>
+      </w:pPr>
+      <w:rPr>
+        <w:rFonts w:ascii="Wingdings" w:hAnsi="Wingdings" w:hint="default"/>
+        <w:sz w:val="20"/>
+      </w:rPr>
+    </w:lvl>
+    <w:lvl w:ilvl="7" w:tentative="1">
+      <w:start w:val="1"/>
+      <w:numFmt w:val="bullet"/>
+      <w:lvlText w:val=""/>
+      <w:lvlJc w:val="left"/>
+      <w:pPr>
+        <w:tabs>
+          <w:tab w:val="num" w:pos="5760"/>
+        </w:tabs>
+        <w:ind w:left="5760" w:hanging="360"/>
+      </w:pPr>
+      <w:rPr>
+        <w:rFonts w:ascii="Wingdings" w:hAnsi="Wingdings" w:hint="default"/>
+        <w:sz w:val="20"/>
+      </w:rPr>
+    </w:lvl>
+    <w:lvl w:ilvl="8" w:tentative="1">
+      <w:start w:val="1"/>
+      <w:numFmt w:val="bullet"/>
+      <w:lvlText w:val=""/>
+      <w:lvlJc w:val="left"/>
+      <w:pPr>
+        <w:tabs>
+          <w:tab w:val="num" w:pos="6480"/>
+        </w:tabs>
+        <w:ind w:left="6480" w:hanging="360"/>
+      </w:pPr>
+      <w:rPr>
+        <w:rFonts w:ascii="Wingdings" w:hAnsi="Wingdings" w:hint="default"/>
+        <w:sz w:val="20"/>
+      </w:rPr>
+    </w:lvl>
+  </w:abstractNum>
+  <w:abstractNum w:abstractNumId="18" w15:restartNumberingAfterBreak="0">
     <w:nsid w:val="3BCD67C8"/>
     <w:multiLevelType w:val="multilevel"/>
     <w:tmpl w:val="381289F2"/>
@@ -7578,7 +8082,7 @@
       </w:rPr>
     </w:lvl>
   </w:abstractNum>
-  <w:abstractNum w:abstractNumId="18" w15:restartNumberingAfterBreak="0">
+  <w:abstractNum w:abstractNumId="19" w15:restartNumberingAfterBreak="0">
     <w:nsid w:val="43654A08"/>
     <w:multiLevelType w:val="multilevel"/>
     <w:tmpl w:val="BD96D486"/>
@@ -7695,7 +8199,7 @@
       </w:pPr>
     </w:lvl>
   </w:abstractNum>
-  <w:abstractNum w:abstractNumId="19" w15:restartNumberingAfterBreak="0">
+  <w:abstractNum w:abstractNumId="20" w15:restartNumberingAfterBreak="0">
     <w:nsid w:val="452C67AE"/>
     <w:multiLevelType w:val="multilevel"/>
     <w:tmpl w:val="7938F456"/>
@@ -7844,7 +8348,7 @@
       </w:rPr>
     </w:lvl>
   </w:abstractNum>
-  <w:abstractNum w:abstractNumId="20" w15:restartNumberingAfterBreak="0">
+  <w:abstractNum w:abstractNumId="21" w15:restartNumberingAfterBreak="0">
     <w:nsid w:val="45730FF5"/>
     <w:multiLevelType w:val="multilevel"/>
     <w:tmpl w:val="D79AE8F8"/>
@@ -7993,7 +8497,7 @@
       </w:rPr>
     </w:lvl>
   </w:abstractNum>
-  <w:abstractNum w:abstractNumId="21" w15:restartNumberingAfterBreak="0">
+  <w:abstractNum w:abstractNumId="22" w15:restartNumberingAfterBreak="0">
     <w:nsid w:val="46666D50"/>
     <w:multiLevelType w:val="multilevel"/>
     <w:tmpl w:val="AD34562C"/>
@@ -8142,7 +8646,7 @@
       </w:rPr>
     </w:lvl>
   </w:abstractNum>
-  <w:abstractNum w:abstractNumId="22" w15:restartNumberingAfterBreak="0">
+  <w:abstractNum w:abstractNumId="23" w15:restartNumberingAfterBreak="0">
     <w:nsid w:val="476B073C"/>
     <w:multiLevelType w:val="multilevel"/>
     <w:tmpl w:val="A0F69EEA"/>
@@ -8255,7 +8759,7 @@
       </w:rPr>
     </w:lvl>
   </w:abstractNum>
-  <w:abstractNum w:abstractNumId="23" w15:restartNumberingAfterBreak="0">
+  <w:abstractNum w:abstractNumId="24" w15:restartNumberingAfterBreak="0">
     <w:nsid w:val="4879142D"/>
     <w:multiLevelType w:val="multilevel"/>
     <w:tmpl w:val="75D25706"/>
@@ -8404,7 +8908,7 @@
       </w:rPr>
     </w:lvl>
   </w:abstractNum>
-  <w:abstractNum w:abstractNumId="24" w15:restartNumberingAfterBreak="0">
+  <w:abstractNum w:abstractNumId="25" w15:restartNumberingAfterBreak="0">
     <w:nsid w:val="48A81226"/>
     <w:multiLevelType w:val="multilevel"/>
     <w:tmpl w:val="F08A643C"/>
@@ -8517,7 +9021,7 @@
       </w:rPr>
     </w:lvl>
   </w:abstractNum>
-  <w:abstractNum w:abstractNumId="25" w15:restartNumberingAfterBreak="0">
+  <w:abstractNum w:abstractNumId="26" w15:restartNumberingAfterBreak="0">
     <w:nsid w:val="49186B2B"/>
     <w:multiLevelType w:val="multilevel"/>
     <w:tmpl w:val="BFDC13E2"/>
@@ -8630,7 +9134,7 @@
       </w:rPr>
     </w:lvl>
   </w:abstractNum>
-  <w:abstractNum w:abstractNumId="26" w15:restartNumberingAfterBreak="0">
+  <w:abstractNum w:abstractNumId="27" w15:restartNumberingAfterBreak="0">
     <w:nsid w:val="4D310ACE"/>
     <w:multiLevelType w:val="multilevel"/>
     <w:tmpl w:val="580295BC"/>
@@ -8747,7 +9251,7 @@
       </w:pPr>
     </w:lvl>
   </w:abstractNum>
-  <w:abstractNum w:abstractNumId="27" w15:restartNumberingAfterBreak="0">
+  <w:abstractNum w:abstractNumId="28" w15:restartNumberingAfterBreak="0">
     <w:nsid w:val="5043520D"/>
     <w:multiLevelType w:val="hybridMultilevel"/>
     <w:tmpl w:val="159C4FE2"/>
@@ -8860,7 +9364,7 @@
       </w:rPr>
     </w:lvl>
   </w:abstractNum>
-  <w:abstractNum w:abstractNumId="28" w15:restartNumberingAfterBreak="0">
+  <w:abstractNum w:abstractNumId="29" w15:restartNumberingAfterBreak="0">
     <w:nsid w:val="51823288"/>
     <w:multiLevelType w:val="multilevel"/>
     <w:tmpl w:val="4C802E68"/>
@@ -8973,7 +9477,7 @@
       </w:rPr>
     </w:lvl>
   </w:abstractNum>
-  <w:abstractNum w:abstractNumId="29" w15:restartNumberingAfterBreak="0">
+  <w:abstractNum w:abstractNumId="30" w15:restartNumberingAfterBreak="0">
     <w:nsid w:val="53F24517"/>
     <w:multiLevelType w:val="multilevel"/>
     <w:tmpl w:val="6B645BE2"/>
@@ -9086,7 +9590,7 @@
       </w:rPr>
     </w:lvl>
   </w:abstractNum>
-  <w:abstractNum w:abstractNumId="30" w15:restartNumberingAfterBreak="0">
+  <w:abstractNum w:abstractNumId="31" w15:restartNumberingAfterBreak="0">
     <w:nsid w:val="5A720516"/>
     <w:multiLevelType w:val="hybridMultilevel"/>
     <w:tmpl w:val="8272BB78"/>
@@ -9200,7 +9704,7 @@
       </w:rPr>
     </w:lvl>
   </w:abstractNum>
-  <w:abstractNum w:abstractNumId="31" w15:restartNumberingAfterBreak="0">
+  <w:abstractNum w:abstractNumId="32" w15:restartNumberingAfterBreak="0">
     <w:nsid w:val="5B7841FC"/>
     <w:multiLevelType w:val="multilevel"/>
     <w:tmpl w:val="63145008"/>
@@ -9317,7 +9821,7 @@
       </w:pPr>
     </w:lvl>
   </w:abstractNum>
-  <w:abstractNum w:abstractNumId="32" w15:restartNumberingAfterBreak="0">
+  <w:abstractNum w:abstractNumId="33" w15:restartNumberingAfterBreak="0">
     <w:nsid w:val="5F0E64E7"/>
     <w:multiLevelType w:val="multilevel"/>
     <w:tmpl w:val="7008559C"/>
@@ -9466,7 +9970,7 @@
       </w:rPr>
     </w:lvl>
   </w:abstractNum>
-  <w:abstractNum w:abstractNumId="33" w15:restartNumberingAfterBreak="0">
+  <w:abstractNum w:abstractNumId="34" w15:restartNumberingAfterBreak="0">
     <w:nsid w:val="651E7AA1"/>
     <w:multiLevelType w:val="multilevel"/>
     <w:tmpl w:val="C3D2DDA0"/>
@@ -9579,7 +10083,7 @@
       </w:rPr>
     </w:lvl>
   </w:abstractNum>
-  <w:abstractNum w:abstractNumId="34" w15:restartNumberingAfterBreak="0">
+  <w:abstractNum w:abstractNumId="35" w15:restartNumberingAfterBreak="0">
     <w:nsid w:val="69907E7B"/>
     <w:multiLevelType w:val="multilevel"/>
     <w:tmpl w:val="53C668D2"/>
@@ -9692,7 +10196,7 @@
       </w:rPr>
     </w:lvl>
   </w:abstractNum>
-  <w:abstractNum w:abstractNumId="35" w15:restartNumberingAfterBreak="0">
+  <w:abstractNum w:abstractNumId="36" w15:restartNumberingAfterBreak="0">
     <w:nsid w:val="69DA2BE3"/>
     <w:multiLevelType w:val="hybridMultilevel"/>
     <w:tmpl w:val="A292640C"/>
@@ -9805,7 +10309,7 @@
       </w:rPr>
     </w:lvl>
   </w:abstractNum>
-  <w:abstractNum w:abstractNumId="36" w15:restartNumberingAfterBreak="0">
+  <w:abstractNum w:abstractNumId="37" w15:restartNumberingAfterBreak="0">
     <w:nsid w:val="6F46121E"/>
     <w:multiLevelType w:val="multilevel"/>
     <w:tmpl w:val="50CC2EC0"/>
@@ -9918,7 +10422,7 @@
       </w:rPr>
     </w:lvl>
   </w:abstractNum>
-  <w:abstractNum w:abstractNumId="37" w15:restartNumberingAfterBreak="0">
+  <w:abstractNum w:abstractNumId="38" w15:restartNumberingAfterBreak="0">
     <w:nsid w:val="79550390"/>
     <w:multiLevelType w:val="multilevel"/>
     <w:tmpl w:val="BF909C92"/>
@@ -10067,7 +10571,7 @@
       </w:rPr>
     </w:lvl>
   </w:abstractNum>
-  <w:abstractNum w:abstractNumId="38" w15:restartNumberingAfterBreak="0">
+  <w:abstractNum w:abstractNumId="39" w15:restartNumberingAfterBreak="0">
     <w:nsid w:val="7A0E2E7C"/>
     <w:multiLevelType w:val="multilevel"/>
     <w:tmpl w:val="01404FD8"/>
@@ -10180,7 +10684,7 @@
       </w:rPr>
     </w:lvl>
   </w:abstractNum>
-  <w:abstractNum w:abstractNumId="39" w15:restartNumberingAfterBreak="0">
+  <w:abstractNum w:abstractNumId="40" w15:restartNumberingAfterBreak="0">
     <w:nsid w:val="7C674809"/>
     <w:multiLevelType w:val="multilevel"/>
     <w:tmpl w:val="825C63BC"/>
@@ -10329,7 +10833,7 @@
       </w:rPr>
     </w:lvl>
   </w:abstractNum>
-  <w:abstractNum w:abstractNumId="40" w15:restartNumberingAfterBreak="0">
+  <w:abstractNum w:abstractNumId="41" w15:restartNumberingAfterBreak="0">
     <w:nsid w:val="7F291F2D"/>
     <w:multiLevelType w:val="multilevel"/>
     <w:tmpl w:val="578E5604"/>
@@ -10446,7 +10950,7 @@
       </w:pPr>
     </w:lvl>
   </w:abstractNum>
-  <w:abstractNum w:abstractNumId="41" w15:restartNumberingAfterBreak="0">
+  <w:abstractNum w:abstractNumId="42" w15:restartNumberingAfterBreak="0">
     <w:nsid w:val="7FFC30E6"/>
     <w:multiLevelType w:val="multilevel"/>
     <w:tmpl w:val="7DC692BE"/>
@@ -10566,25 +11070,25 @@
     <w:abstractNumId w:val="10"/>
   </w:num>
   <w:num w:numId="3">
-    <w:abstractNumId w:val="22"/>
+    <w:abstractNumId w:val="23"/>
   </w:num>
   <w:num w:numId="4">
     <w:abstractNumId w:val="9"/>
   </w:num>
   <w:num w:numId="5">
-    <w:abstractNumId w:val="20"/>
+    <w:abstractNumId w:val="21"/>
   </w:num>
   <w:num w:numId="6">
-    <w:abstractNumId w:val="35"/>
+    <w:abstractNumId w:val="36"/>
   </w:num>
   <w:num w:numId="7">
-    <w:abstractNumId w:val="27"/>
+    <w:abstractNumId w:val="28"/>
   </w:num>
   <w:num w:numId="8">
     <w:abstractNumId w:val="3"/>
   </w:num>
   <w:num w:numId="9">
-    <w:abstractNumId w:val="39"/>
+    <w:abstractNumId w:val="40"/>
   </w:num>
   <w:num w:numId="10">
     <w:abstractNumId w:val="1"/>
@@ -10593,28 +11097,28 @@
     <w:abstractNumId w:val="0"/>
   </w:num>
   <w:num w:numId="12">
-    <w:abstractNumId w:val="18"/>
+    <w:abstractNumId w:val="19"/>
   </w:num>
   <w:num w:numId="13">
     <w:abstractNumId w:val="8"/>
   </w:num>
   <w:num w:numId="14">
-    <w:abstractNumId w:val="40"/>
+    <w:abstractNumId w:val="41"/>
   </w:num>
   <w:num w:numId="15">
-    <w:abstractNumId w:val="26"/>
+    <w:abstractNumId w:val="27"/>
   </w:num>
   <w:num w:numId="16">
-    <w:abstractNumId w:val="31"/>
+    <w:abstractNumId w:val="32"/>
   </w:num>
   <w:num w:numId="17">
     <w:abstractNumId w:val="12"/>
   </w:num>
   <w:num w:numId="18">
-    <w:abstractNumId w:val="30"/>
+    <w:abstractNumId w:val="31"/>
   </w:num>
   <w:num w:numId="19">
-    <w:abstractNumId w:val="22"/>
+    <w:abstractNumId w:val="23"/>
     <w:lvlOverride w:ilvl="0">
       <w:lvl w:ilvl="0">
         <w:start w:val="1"/>
@@ -10743,16 +11247,16 @@
     </w:lvlOverride>
   </w:num>
   <w:num w:numId="20">
-    <w:abstractNumId w:val="29"/>
+    <w:abstractNumId w:val="30"/>
   </w:num>
   <w:num w:numId="21">
-    <w:abstractNumId w:val="17"/>
+    <w:abstractNumId w:val="18"/>
   </w:num>
   <w:num w:numId="22">
     <w:abstractNumId w:val="13"/>
   </w:num>
   <w:num w:numId="23">
-    <w:abstractNumId w:val="38"/>
+    <w:abstractNumId w:val="39"/>
   </w:num>
   <w:num w:numId="24">
     <w:abstractNumId w:val="13"/>
@@ -10885,25 +11389,25 @@
     </w:lvlOverride>
   </w:num>
   <w:num w:numId="25">
-    <w:abstractNumId w:val="25"/>
+    <w:abstractNumId w:val="26"/>
   </w:num>
   <w:num w:numId="26">
-    <w:abstractNumId w:val="33"/>
+    <w:abstractNumId w:val="34"/>
   </w:num>
   <w:num w:numId="27">
-    <w:abstractNumId w:val="34"/>
+    <w:abstractNumId w:val="35"/>
   </w:num>
   <w:num w:numId="28">
-    <w:abstractNumId w:val="36"/>
+    <w:abstractNumId w:val="37"/>
   </w:num>
   <w:num w:numId="29">
-    <w:abstractNumId w:val="28"/>
+    <w:abstractNumId w:val="29"/>
   </w:num>
   <w:num w:numId="30">
-    <w:abstractNumId w:val="41"/>
+    <w:abstractNumId w:val="42"/>
   </w:num>
   <w:num w:numId="31">
-    <w:abstractNumId w:val="24"/>
+    <w:abstractNumId w:val="25"/>
   </w:num>
   <w:num w:numId="32">
     <w:abstractNumId w:val="5"/>
@@ -10921,13 +11425,13 @@
     <w:abstractNumId w:val="11"/>
   </w:num>
   <w:num w:numId="37">
-    <w:abstractNumId w:val="21"/>
+    <w:abstractNumId w:val="22"/>
   </w:num>
   <w:num w:numId="38">
     <w:abstractNumId w:val="16"/>
   </w:num>
   <w:num w:numId="39">
-    <w:abstractNumId w:val="32"/>
+    <w:abstractNumId w:val="33"/>
   </w:num>
   <w:num w:numId="40">
     <w:abstractNumId w:val="13"/>
@@ -10996,19 +11500,22 @@
     </w:lvlOverride>
   </w:num>
   <w:num w:numId="44">
-    <w:abstractNumId w:val="23"/>
+    <w:abstractNumId w:val="24"/>
   </w:num>
   <w:num w:numId="45">
-    <w:abstractNumId w:val="19"/>
+    <w:abstractNumId w:val="20"/>
   </w:num>
   <w:num w:numId="46">
-    <w:abstractNumId w:val="37"/>
+    <w:abstractNumId w:val="38"/>
   </w:num>
   <w:num w:numId="47">
     <w:abstractNumId w:val="4"/>
   </w:num>
   <w:num w:numId="48">
     <w:abstractNumId w:val="6"/>
+  </w:num>
+  <w:num w:numId="49">
+    <w:abstractNumId w:val="17"/>
   </w:num>
   <w:numIdMacAtCleanup w:val="17"/>
 </w:numbering>
@@ -12241,7 +12748,7 @@
 </file>
 
 <file path=customXml/itemProps1.xml><?xml version="1.0" encoding="utf-8"?>
-<ds:datastoreItem xmlns:ds="http://schemas.openxmlformats.org/officeDocument/2006/customXml" ds:itemID="{C8063F30-BE3D-4463-9A0E-BBFA64DF10A3}">
+<ds:datastoreItem xmlns:ds="http://schemas.openxmlformats.org/officeDocument/2006/customXml" ds:itemID="{9CAF92FD-E1CF-4713-9E1F-105798D84652}">
   <ds:schemaRefs>
     <ds:schemaRef ds:uri="http://schemas.openxmlformats.org/officeDocument/2006/bibliography"/>
   </ds:schemaRefs>

</xml_diff>